<commit_message>
Add explicit Syntax and Output sections to Lab 17 final
</commit_message>
<xml_diff>
--- a/Lab17/lab17_output/lab_17_final.docx
+++ b/Lab17/lab17_output/lab_17_final.docx
@@ -635,6 +635,14 @@
     </w:p>
     <w:p>
       <w:pPr>
+        <w:pStyle w:val="BodyText"/>
+      </w:pPr>
+      <w:r>
+        <w:t xml:space="preserve">Syntax:</w:t>
+      </w:r>
+    </w:p>
+    <w:p>
+      <w:pPr>
         <w:pStyle w:val="SourceCode"/>
       </w:pPr>
       <w:r>
@@ -745,6 +753,56 @@
         </w:rPr>
         <w:t xml:space="preserve">(stargazer)</w:t>
       </w:r>
+      <w:r>
+        <w:br/>
+      </w:r>
+      <w:r>
+        <w:br/>
+      </w:r>
+      <w:r>
+        <w:rPr>
+          <w:rStyle w:val="FunctionTok"/>
+        </w:rPr>
+        <w:t xml:space="preserve">search</w:t>
+      </w:r>
+      <w:r>
+        <w:rPr>
+          <w:rStyle w:val="NormalTok"/>
+        </w:rPr>
+        <w:t xml:space="preserve">()[</w:t>
+      </w:r>
+      <w:r>
+        <w:rPr>
+          <w:rStyle w:val="DecValTok"/>
+        </w:rPr>
+        <w:t xml:space="preserve">1</w:t>
+      </w:r>
+      <w:r>
+        <w:rPr>
+          <w:rStyle w:val="SpecialCharTok"/>
+        </w:rPr>
+        <w:t xml:space="preserve">:</w:t>
+      </w:r>
+      <w:r>
+        <w:rPr>
+          <w:rStyle w:val="DecValTok"/>
+        </w:rPr>
+        <w:t xml:space="preserve">8</w:t>
+      </w:r>
+      <w:r>
+        <w:rPr>
+          <w:rStyle w:val="NormalTok"/>
+        </w:rPr>
+        <w:t xml:space="preserve">]</w:t>
+      </w:r>
+    </w:p>
+    <w:p>
+      <w:pPr>
+        <w:pStyle w:val="FirstParagraph"/>
+      </w:pPr>
+      <w:r>
+        <w:t xml:space="preserve">Output:</w:t>
+      </w:r>
     </w:p>
     <w:p>
       <w:pPr>
@@ -786,47 +844,6 @@
           <w:rStyle w:val="VerbatimChar"/>
         </w:rPr>
         <w:t xml:space="preserve">##  R package version 5.2.3. https://CRAN.R-project.org/package=stargazer</w:t>
-      </w:r>
-    </w:p>
-    <w:p>
-      <w:pPr>
-        <w:pStyle w:val="SourceCode"/>
-      </w:pPr>
-      <w:r>
-        <w:rPr>
-          <w:rStyle w:val="FunctionTok"/>
-        </w:rPr>
-        <w:t xml:space="preserve">search</w:t>
-      </w:r>
-      <w:r>
-        <w:rPr>
-          <w:rStyle w:val="NormalTok"/>
-        </w:rPr>
-        <w:t xml:space="preserve">()[</w:t>
-      </w:r>
-      <w:r>
-        <w:rPr>
-          <w:rStyle w:val="DecValTok"/>
-        </w:rPr>
-        <w:t xml:space="preserve">1</w:t>
-      </w:r>
-      <w:r>
-        <w:rPr>
-          <w:rStyle w:val="SpecialCharTok"/>
-        </w:rPr>
-        <w:t xml:space="preserve">:</w:t>
-      </w:r>
-      <w:r>
-        <w:rPr>
-          <w:rStyle w:val="DecValTok"/>
-        </w:rPr>
-        <w:t xml:space="preserve">8</w:t>
-      </w:r>
-      <w:r>
-        <w:rPr>
-          <w:rStyle w:val="NormalTok"/>
-        </w:rPr>
-        <w:t xml:space="preserve">]</w:t>
       </w:r>
     </w:p>
     <w:p>
@@ -932,6 +949,14 @@
     </w:p>
     <w:p>
       <w:pPr>
+        <w:pStyle w:val="BodyText"/>
+      </w:pPr>
+      <w:r>
+        <w:t xml:space="preserve">Syntax:</w:t>
+      </w:r>
+    </w:p>
+    <w:p>
+      <w:pPr>
         <w:pStyle w:val="SourceCode"/>
       </w:pPr>
       <w:r>
@@ -972,6 +997,14 @@
           <w:rStyle w:val="NormalTok"/>
         </w:rPr>
         <w:t xml:space="preserve">()</w:t>
+      </w:r>
+    </w:p>
+    <w:p>
+      <w:pPr>
+        <w:pStyle w:val="FirstParagraph"/>
+      </w:pPr>
+      <w:r>
+        <w:t xml:space="preserve">Output:</w:t>
       </w:r>
     </w:p>
     <w:p>
@@ -1005,6 +1038,14 @@
     </w:p>
     <w:p>
       <w:pPr>
+        <w:pStyle w:val="BodyText"/>
+      </w:pPr>
+      <w:r>
+        <w:t xml:space="preserve">Syntax:</w:t>
+      </w:r>
+    </w:p>
+    <w:p>
+      <w:pPr>
         <w:pStyle w:val="SourceCode"/>
       </w:pPr>
       <w:r>
@@ -1691,6 +1732,74 @@
         </w:rPr>
         <w:t xml:space="preserve">(m_base)</w:t>
       </w:r>
+      <w:r>
+        <w:br/>
+      </w:r>
+      <w:r>
+        <w:rPr>
+          <w:rStyle w:val="FunctionTok"/>
+        </w:rPr>
+        <w:t xml:space="preserve">summary</w:t>
+      </w:r>
+      <w:r>
+        <w:rPr>
+          <w:rStyle w:val="NormalTok"/>
+        </w:rPr>
+        <w:t xml:space="preserve">(m_mat)</w:t>
+      </w:r>
+      <w:r>
+        <w:br/>
+      </w:r>
+      <w:r>
+        <w:rPr>
+          <w:rStyle w:val="FunctionTok"/>
+        </w:rPr>
+        <w:t xml:space="preserve">summary</w:t>
+      </w:r>
+      <w:r>
+        <w:rPr>
+          <w:rStyle w:val="NormalTok"/>
+        </w:rPr>
+        <w:t xml:space="preserve">(m_inv)</w:t>
+      </w:r>
+      <w:r>
+        <w:br/>
+      </w:r>
+      <w:r>
+        <w:rPr>
+          <w:rStyle w:val="FunctionTok"/>
+        </w:rPr>
+        <w:t xml:space="preserve">summary</w:t>
+      </w:r>
+      <w:r>
+        <w:rPr>
+          <w:rStyle w:val="NormalTok"/>
+        </w:rPr>
+        <w:t xml:space="preserve">(m_par)</w:t>
+      </w:r>
+      <w:r>
+        <w:br/>
+      </w:r>
+      <w:r>
+        <w:rPr>
+          <w:rStyle w:val="FunctionTok"/>
+        </w:rPr>
+        <w:t xml:space="preserve">summary</w:t>
+      </w:r>
+      <w:r>
+        <w:rPr>
+          <w:rStyle w:val="NormalTok"/>
+        </w:rPr>
+        <w:t xml:space="preserve">(m_all)</w:t>
+      </w:r>
+    </w:p>
+    <w:p>
+      <w:pPr>
+        <w:pStyle w:val="FirstParagraph"/>
+      </w:pPr>
+      <w:r>
+        <w:t xml:space="preserve">Output:</w:t>
+      </w:r>
     </w:p>
     <w:p>
       <w:pPr>
@@ -1952,15 +2061,270 @@
       </w:pPr>
       <w:r>
         <w:rPr>
-          <w:rStyle w:val="FunctionTok"/>
-        </w:rPr>
-        <w:t xml:space="preserve">summary</w:t>
-      </w:r>
-      <w:r>
-        <w:rPr>
-          <w:rStyle w:val="NormalTok"/>
-        </w:rPr>
-        <w:t xml:space="preserve">(m_mat)</w:t>
+          <w:rStyle w:val="VerbatimChar"/>
+        </w:rPr>
+        <w:t xml:space="preserve">## </w:t>
+      </w:r>
+      <w:r>
+        <w:br/>
+      </w:r>
+      <w:r>
+        <w:rPr>
+          <w:rStyle w:val="VerbatimChar"/>
+        </w:rPr>
+        <w:t xml:space="preserve">## Call:</w:t>
+      </w:r>
+      <w:r>
+        <w:br/>
+      </w:r>
+      <w:r>
+        <w:rPr>
+          <w:rStyle w:val="VerbatimChar"/>
+        </w:rPr>
+        <w:t xml:space="preserve">## lm(formula = readingz ~ inc10k + racef + pared + married + momwork + </w:t>
+      </w:r>
+      <w:r>
+        <w:br/>
+      </w:r>
+      <w:r>
+        <w:rPr>
+          <w:rStyle w:val="VerbatimChar"/>
+        </w:rPr>
+        <w:t xml:space="preserve">##     foodsecz + meddummy, data = ess)</w:t>
+      </w:r>
+      <w:r>
+        <w:br/>
+      </w:r>
+      <w:r>
+        <w:rPr>
+          <w:rStyle w:val="VerbatimChar"/>
+        </w:rPr>
+        <w:t xml:space="preserve">## </w:t>
+      </w:r>
+      <w:r>
+        <w:br/>
+      </w:r>
+      <w:r>
+        <w:rPr>
+          <w:rStyle w:val="VerbatimChar"/>
+        </w:rPr>
+        <w:t xml:space="preserve">## Residuals:</w:t>
+      </w:r>
+      <w:r>
+        <w:br/>
+      </w:r>
+      <w:r>
+        <w:rPr>
+          <w:rStyle w:val="VerbatimChar"/>
+        </w:rPr>
+        <w:t xml:space="preserve">##    Min     1Q Median     3Q    Max </w:t>
+      </w:r>
+      <w:r>
+        <w:br/>
+      </w:r>
+      <w:r>
+        <w:rPr>
+          <w:rStyle w:val="VerbatimChar"/>
+        </w:rPr>
+        <w:t xml:space="preserve">## -3.826 -0.568  0.050  0.597  3.061 </w:t>
+      </w:r>
+      <w:r>
+        <w:br/>
+      </w:r>
+      <w:r>
+        <w:rPr>
+          <w:rStyle w:val="VerbatimChar"/>
+        </w:rPr>
+        <w:t xml:space="preserve">## </w:t>
+      </w:r>
+      <w:r>
+        <w:br/>
+      </w:r>
+      <w:r>
+        <w:rPr>
+          <w:rStyle w:val="VerbatimChar"/>
+        </w:rPr>
+        <w:t xml:space="preserve">## Coefficients:</w:t>
+      </w:r>
+      <w:r>
+        <w:br/>
+      </w:r>
+      <w:r>
+        <w:rPr>
+          <w:rStyle w:val="VerbatimChar"/>
+        </w:rPr>
+        <w:t xml:space="preserve">##                        Estimate Std. Error t value             Pr(&gt;|t|)    </w:t>
+      </w:r>
+      <w:r>
+        <w:br/>
+      </w:r>
+      <w:r>
+        <w:rPr>
+          <w:rStyle w:val="VerbatimChar"/>
+        </w:rPr>
+        <w:t xml:space="preserve">## (Intercept)            -0.59635    0.02856  -20.88 &lt; 0.0000000000000002 ***</w:t>
+      </w:r>
+      <w:r>
+        <w:br/>
+      </w:r>
+      <w:r>
+        <w:rPr>
+          <w:rStyle w:val="VerbatimChar"/>
+        </w:rPr>
+        <w:t xml:space="preserve">## inc10k                  0.01397    0.00150    9.31 &lt; 0.0000000000000002 ***</w:t>
+      </w:r>
+      <w:r>
+        <w:br/>
+      </w:r>
+      <w:r>
+        <w:rPr>
+          <w:rStyle w:val="VerbatimChar"/>
+        </w:rPr>
+        <w:t xml:space="preserve">## racefAsian              0.39605    0.04057    9.76 &lt; 0.0000000000000002 ***</w:t>
+      </w:r>
+      <w:r>
+        <w:br/>
+      </w:r>
+      <w:r>
+        <w:rPr>
+          <w:rStyle w:val="VerbatimChar"/>
+        </w:rPr>
+        <w:t xml:space="preserve">## racefBlack             -0.02087    0.02846   -0.73               0.4633    </w:t>
+      </w:r>
+      <w:r>
+        <w:br/>
+      </w:r>
+      <w:r>
+        <w:rPr>
+          <w:rStyle w:val="VerbatimChar"/>
+        </w:rPr>
+        <w:t xml:space="preserve">## racefWhite              0.15968    0.02250    7.10     0.00000000000133 ***</w:t>
+      </w:r>
+      <w:r>
+        <w:br/>
+      </w:r>
+      <w:r>
+        <w:rPr>
+          <w:rStyle w:val="VerbatimChar"/>
+        </w:rPr>
+        <w:t xml:space="preserve">## racefOther             -0.01253    0.03755   -0.33               0.7385    </w:t>
+      </w:r>
+      <w:r>
+        <w:br/>
+      </w:r>
+      <w:r>
+        <w:rPr>
+          <w:rStyle w:val="VerbatimChar"/>
+        </w:rPr>
+        <w:t xml:space="preserve">## paredSome College       0.27881    0.01911   14.59 &lt; 0.0000000000000002 ***</w:t>
+      </w:r>
+      <w:r>
+        <w:br/>
+      </w:r>
+      <w:r>
+        <w:rPr>
+          <w:rStyle w:val="VerbatimChar"/>
+        </w:rPr>
+        <w:t xml:space="preserve">## paredBA                 0.53217    0.02366   22.49 &lt; 0.0000000000000002 ***</w:t>
+      </w:r>
+      <w:r>
+        <w:br/>
+      </w:r>
+      <w:r>
+        <w:rPr>
+          <w:rStyle w:val="VerbatimChar"/>
+        </w:rPr>
+        <w:t xml:space="preserve">## paredPost-BA            0.67974    0.02661   25.54 &lt; 0.0000000000000002 ***</w:t>
+      </w:r>
+      <w:r>
+        <w:br/>
+      </w:r>
+      <w:r>
+        <w:rPr>
+          <w:rStyle w:val="VerbatimChar"/>
+        </w:rPr>
+        <w:t xml:space="preserve">## marriedParents Married  0.14019    0.01894    7.40     0.00000000000014 ***</w:t>
+      </w:r>
+      <w:r>
+        <w:br/>
+      </w:r>
+      <w:r>
+        <w:rPr>
+          <w:rStyle w:val="VerbatimChar"/>
+        </w:rPr>
+        <w:t xml:space="preserve">## momworkWorking mother   0.04617    0.01629    2.83               0.0046 ** </w:t>
+      </w:r>
+      <w:r>
+        <w:br/>
+      </w:r>
+      <w:r>
+        <w:rPr>
+          <w:rStyle w:val="VerbatimChar"/>
+        </w:rPr>
+        <w:t xml:space="preserve">## foodsecz                0.05931    0.00834    7.11     0.00000000000123 ***</w:t>
+      </w:r>
+      <w:r>
+        <w:br/>
+      </w:r>
+      <w:r>
+        <w:rPr>
+          <w:rStyle w:val="VerbatimChar"/>
+        </w:rPr>
+        <w:t xml:space="preserve">## meddummy                0.02186    0.01804    1.21               0.2258    </w:t>
+      </w:r>
+      <w:r>
+        <w:br/>
+      </w:r>
+      <w:r>
+        <w:rPr>
+          <w:rStyle w:val="VerbatimChar"/>
+        </w:rPr>
+        <w:t xml:space="preserve">## ---</w:t>
+      </w:r>
+      <w:r>
+        <w:br/>
+      </w:r>
+      <w:r>
+        <w:rPr>
+          <w:rStyle w:val="VerbatimChar"/>
+        </w:rPr>
+        <w:t xml:space="preserve">## Signif. codes:  0 '***' 0.001 '**' 0.01 '*' 0.05 '.' 0.1 ' ' 1</w:t>
+      </w:r>
+      <w:r>
+        <w:br/>
+      </w:r>
+      <w:r>
+        <w:rPr>
+          <w:rStyle w:val="VerbatimChar"/>
+        </w:rPr>
+        <w:t xml:space="preserve">## </w:t>
+      </w:r>
+      <w:r>
+        <w:br/>
+      </w:r>
+      <w:r>
+        <w:rPr>
+          <w:rStyle w:val="VerbatimChar"/>
+        </w:rPr>
+        <w:t xml:space="preserve">## Residual standard error: 0.908 on 14828 degrees of freedom</w:t>
+      </w:r>
+      <w:r>
+        <w:br/>
+      </w:r>
+      <w:r>
+        <w:rPr>
+          <w:rStyle w:val="VerbatimChar"/>
+        </w:rPr>
+        <w:t xml:space="preserve">## Multiple R-squared:  0.155,  Adjusted R-squared:  0.154 </w:t>
+      </w:r>
+      <w:r>
+        <w:br/>
+      </w:r>
+      <w:r>
+        <w:rPr>
+          <w:rStyle w:val="VerbatimChar"/>
+        </w:rPr>
+        <w:t xml:space="preserve">## F-statistic:  226 on 12 and 14828 DF,  p-value: &lt;0.0000000000000002</w:t>
       </w:r>
     </w:p>
     <w:p>
@@ -1998,7 +2362,7 @@
         <w:rPr>
           <w:rStyle w:val="VerbatimChar"/>
         </w:rPr>
-        <w:t xml:space="preserve">##     foodsecz + meddummy, data = ess)</w:t>
+        <w:t xml:space="preserve">##     cogmatz + parinvz, data = ess)</w:t>
       </w:r>
       <w:r>
         <w:br/>
@@ -2034,7 +2398,7 @@
         <w:rPr>
           <w:rStyle w:val="VerbatimChar"/>
         </w:rPr>
-        <w:t xml:space="preserve">## -3.826 -0.568  0.050  0.597  3.061 </w:t>
+        <w:t xml:space="preserve">## -3.880 -0.562  0.048  0.589  2.979 </w:t>
       </w:r>
       <w:r>
         <w:br/>
@@ -2070,115 +2434,115 @@
         <w:rPr>
           <w:rStyle w:val="VerbatimChar"/>
         </w:rPr>
-        <w:t xml:space="preserve">## (Intercept)            -0.59635    0.02856  -20.88 &lt; 0.0000000000000002 ***</w:t>
-      </w:r>
-      <w:r>
-        <w:br/>
-      </w:r>
-      <w:r>
-        <w:rPr>
-          <w:rStyle w:val="VerbatimChar"/>
-        </w:rPr>
-        <w:t xml:space="preserve">## inc10k                  0.01397    0.00150    9.31 &lt; 0.0000000000000002 ***</w:t>
-      </w:r>
-      <w:r>
-        <w:br/>
-      </w:r>
-      <w:r>
-        <w:rPr>
-          <w:rStyle w:val="VerbatimChar"/>
-        </w:rPr>
-        <w:t xml:space="preserve">## racefAsian              0.39605    0.04057    9.76 &lt; 0.0000000000000002 ***</w:t>
-      </w:r>
-      <w:r>
-        <w:br/>
-      </w:r>
-      <w:r>
-        <w:rPr>
-          <w:rStyle w:val="VerbatimChar"/>
-        </w:rPr>
-        <w:t xml:space="preserve">## racefBlack             -0.02087    0.02846   -0.73               0.4633    </w:t>
-      </w:r>
-      <w:r>
-        <w:br/>
-      </w:r>
-      <w:r>
-        <w:rPr>
-          <w:rStyle w:val="VerbatimChar"/>
-        </w:rPr>
-        <w:t xml:space="preserve">## racefWhite              0.15968    0.02250    7.10     0.00000000000133 ***</w:t>
-      </w:r>
-      <w:r>
-        <w:br/>
-      </w:r>
-      <w:r>
-        <w:rPr>
-          <w:rStyle w:val="VerbatimChar"/>
-        </w:rPr>
-        <w:t xml:space="preserve">## racefOther             -0.01253    0.03755   -0.33               0.7385    </w:t>
-      </w:r>
-      <w:r>
-        <w:br/>
-      </w:r>
-      <w:r>
-        <w:rPr>
-          <w:rStyle w:val="VerbatimChar"/>
-        </w:rPr>
-        <w:t xml:space="preserve">## paredSome College       0.27881    0.01911   14.59 &lt; 0.0000000000000002 ***</w:t>
-      </w:r>
-      <w:r>
-        <w:br/>
-      </w:r>
-      <w:r>
-        <w:rPr>
-          <w:rStyle w:val="VerbatimChar"/>
-        </w:rPr>
-        <w:t xml:space="preserve">## paredBA                 0.53217    0.02366   22.49 &lt; 0.0000000000000002 ***</w:t>
-      </w:r>
-      <w:r>
-        <w:br/>
-      </w:r>
-      <w:r>
-        <w:rPr>
-          <w:rStyle w:val="VerbatimChar"/>
-        </w:rPr>
-        <w:t xml:space="preserve">## paredPost-BA            0.67974    0.02661   25.54 &lt; 0.0000000000000002 ***</w:t>
-      </w:r>
-      <w:r>
-        <w:br/>
-      </w:r>
-      <w:r>
-        <w:rPr>
-          <w:rStyle w:val="VerbatimChar"/>
-        </w:rPr>
-        <w:t xml:space="preserve">## marriedParents Married  0.14019    0.01894    7.40     0.00000000000014 ***</w:t>
-      </w:r>
-      <w:r>
-        <w:br/>
-      </w:r>
-      <w:r>
-        <w:rPr>
-          <w:rStyle w:val="VerbatimChar"/>
-        </w:rPr>
-        <w:t xml:space="preserve">## momworkWorking mother   0.04617    0.01629    2.83               0.0046 ** </w:t>
-      </w:r>
-      <w:r>
-        <w:br/>
-      </w:r>
-      <w:r>
-        <w:rPr>
-          <w:rStyle w:val="VerbatimChar"/>
-        </w:rPr>
-        <w:t xml:space="preserve">## foodsecz                0.05931    0.00834    7.11     0.00000000000123 ***</w:t>
-      </w:r>
-      <w:r>
-        <w:br/>
-      </w:r>
-      <w:r>
-        <w:rPr>
-          <w:rStyle w:val="VerbatimChar"/>
-        </w:rPr>
-        <w:t xml:space="preserve">## meddummy                0.02186    0.01804    1.21               0.2258    </w:t>
+        <w:t xml:space="preserve">## (Intercept)            -0.48074    0.02729  -17.61 &lt; 0.0000000000000002 ***</w:t>
+      </w:r>
+      <w:r>
+        <w:br/>
+      </w:r>
+      <w:r>
+        <w:rPr>
+          <w:rStyle w:val="VerbatimChar"/>
+        </w:rPr>
+        <w:t xml:space="preserve">## inc10k                  0.01183    0.00149    7.91  0.00000000000000265 ***</w:t>
+      </w:r>
+      <w:r>
+        <w:br/>
+      </w:r>
+      <w:r>
+        <w:rPr>
+          <w:rStyle w:val="VerbatimChar"/>
+        </w:rPr>
+        <w:t xml:space="preserve">## racefAsian              0.43486    0.04042   10.76 &lt; 0.0000000000000002 ***</w:t>
+      </w:r>
+      <w:r>
+        <w:br/>
+      </w:r>
+      <w:r>
+        <w:rPr>
+          <w:rStyle w:val="VerbatimChar"/>
+        </w:rPr>
+        <w:t xml:space="preserve">## racefBlack              0.00125    0.02821    0.04               0.9647    </w:t>
+      </w:r>
+      <w:r>
+        <w:br/>
+      </w:r>
+      <w:r>
+        <w:rPr>
+          <w:rStyle w:val="VerbatimChar"/>
+        </w:rPr>
+        <w:t xml:space="preserve">## racefWhite              0.10521    0.02269    4.64  0.00000355059133500 ***</w:t>
+      </w:r>
+      <w:r>
+        <w:br/>
+      </w:r>
+      <w:r>
+        <w:rPr>
+          <w:rStyle w:val="VerbatimChar"/>
+        </w:rPr>
+        <w:t xml:space="preserve">## racefOther             -0.03091    0.03729   -0.83               0.4072    </w:t>
+      </w:r>
+      <w:r>
+        <w:br/>
+      </w:r>
+      <w:r>
+        <w:rPr>
+          <w:rStyle w:val="VerbatimChar"/>
+        </w:rPr>
+        <w:t xml:space="preserve">## paredSome College       0.22423    0.01934   11.59 &lt; 0.0000000000000002 ***</w:t>
+      </w:r>
+      <w:r>
+        <w:br/>
+      </w:r>
+      <w:r>
+        <w:rPr>
+          <w:rStyle w:val="VerbatimChar"/>
+        </w:rPr>
+        <w:t xml:space="preserve">## paredBA                 0.44516    0.02422   18.38 &lt; 0.0000000000000002 ***</w:t>
+      </w:r>
+      <w:r>
+        <w:br/>
+      </w:r>
+      <w:r>
+        <w:rPr>
+          <w:rStyle w:val="VerbatimChar"/>
+        </w:rPr>
+        <w:t xml:space="preserve">## paredPost-BA            0.56594    0.02750   20.58 &lt; 0.0000000000000002 ***</w:t>
+      </w:r>
+      <w:r>
+        <w:br/>
+      </w:r>
+      <w:r>
+        <w:rPr>
+          <w:rStyle w:val="VerbatimChar"/>
+        </w:rPr>
+        <w:t xml:space="preserve">## marriedParents Married  0.11915    0.01887    6.31  0.00000000027959879 ***</w:t>
+      </w:r>
+      <w:r>
+        <w:br/>
+      </w:r>
+      <w:r>
+        <w:rPr>
+          <w:rStyle w:val="VerbatimChar"/>
+        </w:rPr>
+        <w:t xml:space="preserve">## momworkWorking mother   0.04808    0.01616    2.98               0.0029 ** </w:t>
+      </w:r>
+      <w:r>
+        <w:br/>
+      </w:r>
+      <w:r>
+        <w:rPr>
+          <w:rStyle w:val="VerbatimChar"/>
+        </w:rPr>
+        <w:t xml:space="preserve">## cogmatz                 0.10807    0.00902   11.99 &lt; 0.0000000000000002 ***</w:t>
+      </w:r>
+      <w:r>
+        <w:br/>
+      </w:r>
+      <w:r>
+        <w:rPr>
+          <w:rStyle w:val="VerbatimChar"/>
+        </w:rPr>
+        <w:t xml:space="preserve">## parinvz                 0.06892    0.00855    8.06  0.00000000000000082 ***</w:t>
       </w:r>
       <w:r>
         <w:br/>
@@ -2214,25 +2578,25 @@
         <w:rPr>
           <w:rStyle w:val="VerbatimChar"/>
         </w:rPr>
-        <w:t xml:space="preserve">## Residual standard error: 0.908 on 14828 degrees of freedom</w:t>
-      </w:r>
-      <w:r>
-        <w:br/>
-      </w:r>
-      <w:r>
-        <w:rPr>
-          <w:rStyle w:val="VerbatimChar"/>
-        </w:rPr>
-        <w:t xml:space="preserve">## Multiple R-squared:  0.155,  Adjusted R-squared:  0.154 </w:t>
-      </w:r>
-      <w:r>
-        <w:br/>
-      </w:r>
-      <w:r>
-        <w:rPr>
-          <w:rStyle w:val="VerbatimChar"/>
-        </w:rPr>
-        <w:t xml:space="preserve">## F-statistic:  226 on 12 and 14828 DF,  p-value: &lt;0.0000000000000002</w:t>
+        <w:t xml:space="preserve">## Residual standard error: 0.901 on 14828 degrees of freedom</w:t>
+      </w:r>
+      <w:r>
+        <w:br/>
+      </w:r>
+      <w:r>
+        <w:rPr>
+          <w:rStyle w:val="VerbatimChar"/>
+        </w:rPr>
+        <w:t xml:space="preserve">## Multiple R-squared:  0.166,  Adjusted R-squared:  0.166 </w:t>
+      </w:r>
+      <w:r>
+        <w:br/>
+      </w:r>
+      <w:r>
+        <w:rPr>
+          <w:rStyle w:val="VerbatimChar"/>
+        </w:rPr>
+        <w:t xml:space="preserve">## F-statistic:  247 on 12 and 14828 DF,  p-value: &lt;0.0000000000000002</w:t>
       </w:r>
     </w:p>
     <w:p>
@@ -2241,23 +2605,6 @@
       </w:pPr>
       <w:r>
         <w:rPr>
-          <w:rStyle w:val="FunctionTok"/>
-        </w:rPr>
-        <w:t xml:space="preserve">summary</w:t>
-      </w:r>
-      <w:r>
-        <w:rPr>
-          <w:rStyle w:val="NormalTok"/>
-        </w:rPr>
-        <w:t xml:space="preserve">(m_inv)</w:t>
-      </w:r>
-    </w:p>
-    <w:p>
-      <w:pPr>
-        <w:pStyle w:val="SourceCode"/>
-      </w:pPr>
-      <w:r>
-        <w:rPr>
           <w:rStyle w:val="VerbatimChar"/>
         </w:rPr>
         <w:t xml:space="preserve">## </w:t>
@@ -2287,7 +2634,7 @@
         <w:rPr>
           <w:rStyle w:val="VerbatimChar"/>
         </w:rPr>
-        <w:t xml:space="preserve">##     cogmatz + parinvz, data = ess)</w:t>
+        <w:t xml:space="preserve">##     warmthz + cogstimz, data = ess)</w:t>
       </w:r>
       <w:r>
         <w:br/>
@@ -2323,7 +2670,7 @@
         <w:rPr>
           <w:rStyle w:val="VerbatimChar"/>
         </w:rPr>
-        <w:t xml:space="preserve">## -3.880 -0.562  0.048  0.589  2.979 </w:t>
+        <w:t xml:space="preserve">## -3.843 -0.568  0.051  0.597  3.061 </w:t>
       </w:r>
       <w:r>
         <w:br/>
@@ -2359,115 +2706,115 @@
         <w:rPr>
           <w:rStyle w:val="VerbatimChar"/>
         </w:rPr>
-        <w:t xml:space="preserve">## (Intercept)            -0.48074    0.02729  -17.61 &lt; 0.0000000000000002 ***</w:t>
-      </w:r>
-      <w:r>
-        <w:br/>
-      </w:r>
-      <w:r>
-        <w:rPr>
-          <w:rStyle w:val="VerbatimChar"/>
-        </w:rPr>
-        <w:t xml:space="preserve">## inc10k                  0.01183    0.00149    7.91  0.00000000000000265 ***</w:t>
-      </w:r>
-      <w:r>
-        <w:br/>
-      </w:r>
-      <w:r>
-        <w:rPr>
-          <w:rStyle w:val="VerbatimChar"/>
-        </w:rPr>
-        <w:t xml:space="preserve">## racefAsian              0.43486    0.04042   10.76 &lt; 0.0000000000000002 ***</w:t>
-      </w:r>
-      <w:r>
-        <w:br/>
-      </w:r>
-      <w:r>
-        <w:rPr>
-          <w:rStyle w:val="VerbatimChar"/>
-        </w:rPr>
-        <w:t xml:space="preserve">## racefBlack              0.00125    0.02821    0.04               0.9647    </w:t>
-      </w:r>
-      <w:r>
-        <w:br/>
-      </w:r>
-      <w:r>
-        <w:rPr>
-          <w:rStyle w:val="VerbatimChar"/>
-        </w:rPr>
-        <w:t xml:space="preserve">## racefWhite              0.10521    0.02269    4.64  0.00000355059133500 ***</w:t>
-      </w:r>
-      <w:r>
-        <w:br/>
-      </w:r>
-      <w:r>
-        <w:rPr>
-          <w:rStyle w:val="VerbatimChar"/>
-        </w:rPr>
-        <w:t xml:space="preserve">## racefOther             -0.03091    0.03729   -0.83               0.4072    </w:t>
-      </w:r>
-      <w:r>
-        <w:br/>
-      </w:r>
-      <w:r>
-        <w:rPr>
-          <w:rStyle w:val="VerbatimChar"/>
-        </w:rPr>
-        <w:t xml:space="preserve">## paredSome College       0.22423    0.01934   11.59 &lt; 0.0000000000000002 ***</w:t>
-      </w:r>
-      <w:r>
-        <w:br/>
-      </w:r>
-      <w:r>
-        <w:rPr>
-          <w:rStyle w:val="VerbatimChar"/>
-        </w:rPr>
-        <w:t xml:space="preserve">## paredBA                 0.44516    0.02422   18.38 &lt; 0.0000000000000002 ***</w:t>
-      </w:r>
-      <w:r>
-        <w:br/>
-      </w:r>
-      <w:r>
-        <w:rPr>
-          <w:rStyle w:val="VerbatimChar"/>
-        </w:rPr>
-        <w:t xml:space="preserve">## paredPost-BA            0.56594    0.02750   20.58 &lt; 0.0000000000000002 ***</w:t>
-      </w:r>
-      <w:r>
-        <w:br/>
-      </w:r>
-      <w:r>
-        <w:rPr>
-          <w:rStyle w:val="VerbatimChar"/>
-        </w:rPr>
-        <w:t xml:space="preserve">## marriedParents Married  0.11915    0.01887    6.31  0.00000000027959879 ***</w:t>
-      </w:r>
-      <w:r>
-        <w:br/>
-      </w:r>
-      <w:r>
-        <w:rPr>
-          <w:rStyle w:val="VerbatimChar"/>
-        </w:rPr>
-        <w:t xml:space="preserve">## momworkWorking mother   0.04808    0.01616    2.98               0.0029 ** </w:t>
-      </w:r>
-      <w:r>
-        <w:br/>
-      </w:r>
-      <w:r>
-        <w:rPr>
-          <w:rStyle w:val="VerbatimChar"/>
-        </w:rPr>
-        <w:t xml:space="preserve">## cogmatz                 0.10807    0.00902   11.99 &lt; 0.0000000000000002 ***</w:t>
-      </w:r>
-      <w:r>
-        <w:br/>
-      </w:r>
-      <w:r>
-        <w:rPr>
-          <w:rStyle w:val="VerbatimChar"/>
-        </w:rPr>
-        <w:t xml:space="preserve">## parinvz                 0.06892    0.00855    8.06  0.00000000000000082 ***</w:t>
+        <w:t xml:space="preserve">## (Intercept)            -0.61020    0.02625  -23.24 &lt; 0.0000000000000002 ***</w:t>
+      </w:r>
+      <w:r>
+        <w:br/>
+      </w:r>
+      <w:r>
+        <w:rPr>
+          <w:rStyle w:val="VerbatimChar"/>
+        </w:rPr>
+        <w:t xml:space="preserve">## inc10k                  0.01498    0.00149   10.03 &lt; 0.0000000000000002 ***</w:t>
+      </w:r>
+      <w:r>
+        <w:br/>
+      </w:r>
+      <w:r>
+        <w:rPr>
+          <w:rStyle w:val="VerbatimChar"/>
+        </w:rPr>
+        <w:t xml:space="preserve">## racefAsian              0.40868    0.04070   10.04 &lt; 0.0000000000000002 ***</w:t>
+      </w:r>
+      <w:r>
+        <w:br/>
+      </w:r>
+      <w:r>
+        <w:rPr>
+          <w:rStyle w:val="VerbatimChar"/>
+        </w:rPr>
+        <w:t xml:space="preserve">## racefBlack             -0.01942    0.02847   -0.68               0.4952    </w:t>
+      </w:r>
+      <w:r>
+        <w:br/>
+      </w:r>
+      <w:r>
+        <w:rPr>
+          <w:rStyle w:val="VerbatimChar"/>
+        </w:rPr>
+        <w:t xml:space="preserve">## racefWhite              0.16706    0.02249    7.43  0.00000000000011579 ***</w:t>
+      </w:r>
+      <w:r>
+        <w:br/>
+      </w:r>
+      <w:r>
+        <w:rPr>
+          <w:rStyle w:val="VerbatimChar"/>
+        </w:rPr>
+        <w:t xml:space="preserve">## racefOther             -0.01666    0.03764   -0.44               0.6580    </w:t>
+      </w:r>
+      <w:r>
+        <w:br/>
+      </w:r>
+      <w:r>
+        <w:rPr>
+          <w:rStyle w:val="VerbatimChar"/>
+        </w:rPr>
+        <w:t xml:space="preserve">## paredSome College       0.28615    0.01909   14.99 &lt; 0.0000000000000002 ***</w:t>
+      </w:r>
+      <w:r>
+        <w:br/>
+      </w:r>
+      <w:r>
+        <w:rPr>
+          <w:rStyle w:val="VerbatimChar"/>
+        </w:rPr>
+        <w:t xml:space="preserve">## paredBA                 0.54556    0.02356   23.15 &lt; 0.0000000000000002 ***</w:t>
+      </w:r>
+      <w:r>
+        <w:br/>
+      </w:r>
+      <w:r>
+        <w:rPr>
+          <w:rStyle w:val="VerbatimChar"/>
+        </w:rPr>
+        <w:t xml:space="preserve">## paredPost-BA            0.69175    0.02660   26.00 &lt; 0.0000000000000002 ***</w:t>
+      </w:r>
+      <w:r>
+        <w:br/>
+      </w:r>
+      <w:r>
+        <w:rPr>
+          <w:rStyle w:val="VerbatimChar"/>
+        </w:rPr>
+        <w:t xml:space="preserve">## marriedParents Married  0.15358    0.01889    8.13  0.00000000000000046 ***</w:t>
+      </w:r>
+      <w:r>
+        <w:br/>
+      </w:r>
+      <w:r>
+        <w:rPr>
+          <w:rStyle w:val="VerbatimChar"/>
+        </w:rPr>
+        <w:t xml:space="preserve">## momworkWorking mother   0.05326    0.01630    3.27               0.0011 ** </w:t>
+      </w:r>
+      <w:r>
+        <w:br/>
+      </w:r>
+      <w:r>
+        <w:rPr>
+          <w:rStyle w:val="VerbatimChar"/>
+        </w:rPr>
+        <w:t xml:space="preserve">## warmthz                -0.01005    0.00803   -1.25               0.2105    </w:t>
+      </w:r>
+      <w:r>
+        <w:br/>
+      </w:r>
+      <w:r>
+        <w:rPr>
+          <w:rStyle w:val="VerbatimChar"/>
+        </w:rPr>
+        <w:t xml:space="preserve">## cogstimz                0.02328    0.00803    2.90               0.0037 ** </w:t>
       </w:r>
       <w:r>
         <w:br/>
@@ -2503,295 +2850,6 @@
         <w:rPr>
           <w:rStyle w:val="VerbatimChar"/>
         </w:rPr>
-        <w:t xml:space="preserve">## Residual standard error: 0.901 on 14828 degrees of freedom</w:t>
-      </w:r>
-      <w:r>
-        <w:br/>
-      </w:r>
-      <w:r>
-        <w:rPr>
-          <w:rStyle w:val="VerbatimChar"/>
-        </w:rPr>
-        <w:t xml:space="preserve">## Multiple R-squared:  0.166,  Adjusted R-squared:  0.166 </w:t>
-      </w:r>
-      <w:r>
-        <w:br/>
-      </w:r>
-      <w:r>
-        <w:rPr>
-          <w:rStyle w:val="VerbatimChar"/>
-        </w:rPr>
-        <w:t xml:space="preserve">## F-statistic:  247 on 12 and 14828 DF,  p-value: &lt;0.0000000000000002</w:t>
-      </w:r>
-    </w:p>
-    <w:p>
-      <w:pPr>
-        <w:pStyle w:val="SourceCode"/>
-      </w:pPr>
-      <w:r>
-        <w:rPr>
-          <w:rStyle w:val="FunctionTok"/>
-        </w:rPr>
-        <w:t xml:space="preserve">summary</w:t>
-      </w:r>
-      <w:r>
-        <w:rPr>
-          <w:rStyle w:val="NormalTok"/>
-        </w:rPr>
-        <w:t xml:space="preserve">(m_par)</w:t>
-      </w:r>
-    </w:p>
-    <w:p>
-      <w:pPr>
-        <w:pStyle w:val="SourceCode"/>
-      </w:pPr>
-      <w:r>
-        <w:rPr>
-          <w:rStyle w:val="VerbatimChar"/>
-        </w:rPr>
-        <w:t xml:space="preserve">## </w:t>
-      </w:r>
-      <w:r>
-        <w:br/>
-      </w:r>
-      <w:r>
-        <w:rPr>
-          <w:rStyle w:val="VerbatimChar"/>
-        </w:rPr>
-        <w:t xml:space="preserve">## Call:</w:t>
-      </w:r>
-      <w:r>
-        <w:br/>
-      </w:r>
-      <w:r>
-        <w:rPr>
-          <w:rStyle w:val="VerbatimChar"/>
-        </w:rPr>
-        <w:t xml:space="preserve">## lm(formula = readingz ~ inc10k + racef + pared + married + momwork + </w:t>
-      </w:r>
-      <w:r>
-        <w:br/>
-      </w:r>
-      <w:r>
-        <w:rPr>
-          <w:rStyle w:val="VerbatimChar"/>
-        </w:rPr>
-        <w:t xml:space="preserve">##     warmthz + cogstimz, data = ess)</w:t>
-      </w:r>
-      <w:r>
-        <w:br/>
-      </w:r>
-      <w:r>
-        <w:rPr>
-          <w:rStyle w:val="VerbatimChar"/>
-        </w:rPr>
-        <w:t xml:space="preserve">## </w:t>
-      </w:r>
-      <w:r>
-        <w:br/>
-      </w:r>
-      <w:r>
-        <w:rPr>
-          <w:rStyle w:val="VerbatimChar"/>
-        </w:rPr>
-        <w:t xml:space="preserve">## Residuals:</w:t>
-      </w:r>
-      <w:r>
-        <w:br/>
-      </w:r>
-      <w:r>
-        <w:rPr>
-          <w:rStyle w:val="VerbatimChar"/>
-        </w:rPr>
-        <w:t xml:space="preserve">##    Min     1Q Median     3Q    Max </w:t>
-      </w:r>
-      <w:r>
-        <w:br/>
-      </w:r>
-      <w:r>
-        <w:rPr>
-          <w:rStyle w:val="VerbatimChar"/>
-        </w:rPr>
-        <w:t xml:space="preserve">## -3.843 -0.568  0.051  0.597  3.061 </w:t>
-      </w:r>
-      <w:r>
-        <w:br/>
-      </w:r>
-      <w:r>
-        <w:rPr>
-          <w:rStyle w:val="VerbatimChar"/>
-        </w:rPr>
-        <w:t xml:space="preserve">## </w:t>
-      </w:r>
-      <w:r>
-        <w:br/>
-      </w:r>
-      <w:r>
-        <w:rPr>
-          <w:rStyle w:val="VerbatimChar"/>
-        </w:rPr>
-        <w:t xml:space="preserve">## Coefficients:</w:t>
-      </w:r>
-      <w:r>
-        <w:br/>
-      </w:r>
-      <w:r>
-        <w:rPr>
-          <w:rStyle w:val="VerbatimChar"/>
-        </w:rPr>
-        <w:t xml:space="preserve">##                        Estimate Std. Error t value             Pr(&gt;|t|)    </w:t>
-      </w:r>
-      <w:r>
-        <w:br/>
-      </w:r>
-      <w:r>
-        <w:rPr>
-          <w:rStyle w:val="VerbatimChar"/>
-        </w:rPr>
-        <w:t xml:space="preserve">## (Intercept)            -0.61020    0.02625  -23.24 &lt; 0.0000000000000002 ***</w:t>
-      </w:r>
-      <w:r>
-        <w:br/>
-      </w:r>
-      <w:r>
-        <w:rPr>
-          <w:rStyle w:val="VerbatimChar"/>
-        </w:rPr>
-        <w:t xml:space="preserve">## inc10k                  0.01498    0.00149   10.03 &lt; 0.0000000000000002 ***</w:t>
-      </w:r>
-      <w:r>
-        <w:br/>
-      </w:r>
-      <w:r>
-        <w:rPr>
-          <w:rStyle w:val="VerbatimChar"/>
-        </w:rPr>
-        <w:t xml:space="preserve">## racefAsian              0.40868    0.04070   10.04 &lt; 0.0000000000000002 ***</w:t>
-      </w:r>
-      <w:r>
-        <w:br/>
-      </w:r>
-      <w:r>
-        <w:rPr>
-          <w:rStyle w:val="VerbatimChar"/>
-        </w:rPr>
-        <w:t xml:space="preserve">## racefBlack             -0.01942    0.02847   -0.68               0.4952    </w:t>
-      </w:r>
-      <w:r>
-        <w:br/>
-      </w:r>
-      <w:r>
-        <w:rPr>
-          <w:rStyle w:val="VerbatimChar"/>
-        </w:rPr>
-        <w:t xml:space="preserve">## racefWhite              0.16706    0.02249    7.43  0.00000000000011579 ***</w:t>
-      </w:r>
-      <w:r>
-        <w:br/>
-      </w:r>
-      <w:r>
-        <w:rPr>
-          <w:rStyle w:val="VerbatimChar"/>
-        </w:rPr>
-        <w:t xml:space="preserve">## racefOther             -0.01666    0.03764   -0.44               0.6580    </w:t>
-      </w:r>
-      <w:r>
-        <w:br/>
-      </w:r>
-      <w:r>
-        <w:rPr>
-          <w:rStyle w:val="VerbatimChar"/>
-        </w:rPr>
-        <w:t xml:space="preserve">## paredSome College       0.28615    0.01909   14.99 &lt; 0.0000000000000002 ***</w:t>
-      </w:r>
-      <w:r>
-        <w:br/>
-      </w:r>
-      <w:r>
-        <w:rPr>
-          <w:rStyle w:val="VerbatimChar"/>
-        </w:rPr>
-        <w:t xml:space="preserve">## paredBA                 0.54556    0.02356   23.15 &lt; 0.0000000000000002 ***</w:t>
-      </w:r>
-      <w:r>
-        <w:br/>
-      </w:r>
-      <w:r>
-        <w:rPr>
-          <w:rStyle w:val="VerbatimChar"/>
-        </w:rPr>
-        <w:t xml:space="preserve">## paredPost-BA            0.69175    0.02660   26.00 &lt; 0.0000000000000002 ***</w:t>
-      </w:r>
-      <w:r>
-        <w:br/>
-      </w:r>
-      <w:r>
-        <w:rPr>
-          <w:rStyle w:val="VerbatimChar"/>
-        </w:rPr>
-        <w:t xml:space="preserve">## marriedParents Married  0.15358    0.01889    8.13  0.00000000000000046 ***</w:t>
-      </w:r>
-      <w:r>
-        <w:br/>
-      </w:r>
-      <w:r>
-        <w:rPr>
-          <w:rStyle w:val="VerbatimChar"/>
-        </w:rPr>
-        <w:t xml:space="preserve">## momworkWorking mother   0.05326    0.01630    3.27               0.0011 ** </w:t>
-      </w:r>
-      <w:r>
-        <w:br/>
-      </w:r>
-      <w:r>
-        <w:rPr>
-          <w:rStyle w:val="VerbatimChar"/>
-        </w:rPr>
-        <w:t xml:space="preserve">## warmthz                -0.01005    0.00803   -1.25               0.2105    </w:t>
-      </w:r>
-      <w:r>
-        <w:br/>
-      </w:r>
-      <w:r>
-        <w:rPr>
-          <w:rStyle w:val="VerbatimChar"/>
-        </w:rPr>
-        <w:t xml:space="preserve">## cogstimz                0.02328    0.00803    2.90               0.0037 ** </w:t>
-      </w:r>
-      <w:r>
-        <w:br/>
-      </w:r>
-      <w:r>
-        <w:rPr>
-          <w:rStyle w:val="VerbatimChar"/>
-        </w:rPr>
-        <w:t xml:space="preserve">## ---</w:t>
-      </w:r>
-      <w:r>
-        <w:br/>
-      </w:r>
-      <w:r>
-        <w:rPr>
-          <w:rStyle w:val="VerbatimChar"/>
-        </w:rPr>
-        <w:t xml:space="preserve">## Signif. codes:  0 '***' 0.001 '**' 0.01 '*' 0.05 '.' 0.1 ' ' 1</w:t>
-      </w:r>
-      <w:r>
-        <w:br/>
-      </w:r>
-      <w:r>
-        <w:rPr>
-          <w:rStyle w:val="VerbatimChar"/>
-        </w:rPr>
-        <w:t xml:space="preserve">## </w:t>
-      </w:r>
-      <w:r>
-        <w:br/>
-      </w:r>
-      <w:r>
-        <w:rPr>
-          <w:rStyle w:val="VerbatimChar"/>
-        </w:rPr>
         <w:t xml:space="preserve">## Residual standard error: 0.909 on 14828 degrees of freedom</w:t>
       </w:r>
       <w:r>
@@ -2811,23 +2869,6 @@
           <w:rStyle w:val="VerbatimChar"/>
         </w:rPr>
         <w:t xml:space="preserve">## F-statistic:  222 on 12 and 14828 DF,  p-value: &lt;0.0000000000000002</w:t>
-      </w:r>
-    </w:p>
-    <w:p>
-      <w:pPr>
-        <w:pStyle w:val="SourceCode"/>
-      </w:pPr>
-      <w:r>
-        <w:rPr>
-          <w:rStyle w:val="FunctionTok"/>
-        </w:rPr>
-        <w:t xml:space="preserve">summary</w:t>
-      </w:r>
-      <w:r>
-        <w:rPr>
-          <w:rStyle w:val="NormalTok"/>
-        </w:rPr>
-        <w:t xml:space="preserve">(m_all)</w:t>
       </w:r>
     </w:p>
     <w:p>
@@ -3274,6 +3315,14 @@
     </w:p>
     <w:p>
       <w:pPr>
+        <w:pStyle w:val="BodyText"/>
+      </w:pPr>
+      <w:r>
+        <w:t xml:space="preserve">Syntax:</w:t>
+      </w:r>
+    </w:p>
+    <w:p>
+      <w:pPr>
         <w:pStyle w:val="SourceCode"/>
       </w:pPr>
       <w:r>
@@ -4130,6 +4179,14 @@
           <w:rStyle w:val="NormalTok"/>
         </w:rPr>
         <w:t xml:space="preserve">)</w:t>
+      </w:r>
+    </w:p>
+    <w:p>
+      <w:pPr>
+        <w:pStyle w:val="FirstParagraph"/>
+      </w:pPr>
+      <w:r>
+        <w:t xml:space="preserve">Output:</w:t>
       </w:r>
     </w:p>
     <w:p>
@@ -4808,7 +4865,7 @@
         <w:pStyle w:val="FirstParagraph"/>
       </w:pPr>
       <w:r>
-        <w:t xml:space="preserve">Syntax</w:t>
+        <w:t xml:space="preserve">Syntax:</w:t>
       </w:r>
     </w:p>
     <w:p>
@@ -4827,6 +4884,92 @@
         </w:rPr>
         <w:t xml:space="preserve">(m_base, m_mat)</w:t>
       </w:r>
+      <w:r>
+        <w:br/>
+      </w:r>
+      <w:r>
+        <w:rPr>
+          <w:rStyle w:val="FunctionTok"/>
+        </w:rPr>
+        <w:t xml:space="preserve">anova</w:t>
+      </w:r>
+      <w:r>
+        <w:rPr>
+          <w:rStyle w:val="NormalTok"/>
+        </w:rPr>
+        <w:t xml:space="preserve">(m_base, m_inv)</w:t>
+      </w:r>
+      <w:r>
+        <w:br/>
+      </w:r>
+      <w:r>
+        <w:rPr>
+          <w:rStyle w:val="FunctionTok"/>
+        </w:rPr>
+        <w:t xml:space="preserve">anova</w:t>
+      </w:r>
+      <w:r>
+        <w:rPr>
+          <w:rStyle w:val="NormalTok"/>
+        </w:rPr>
+        <w:t xml:space="preserve">(m_base, m_par)</w:t>
+      </w:r>
+      <w:r>
+        <w:br/>
+      </w:r>
+      <w:r>
+        <w:br/>
+      </w:r>
+      <w:r>
+        <w:rPr>
+          <w:rStyle w:val="FunctionTok"/>
+        </w:rPr>
+        <w:t xml:space="preserve">anova</w:t>
+      </w:r>
+      <w:r>
+        <w:rPr>
+          <w:rStyle w:val="NormalTok"/>
+        </w:rPr>
+        <w:t xml:space="preserve">(m_mat, m_all)</w:t>
+      </w:r>
+      <w:r>
+        <w:br/>
+      </w:r>
+      <w:r>
+        <w:rPr>
+          <w:rStyle w:val="FunctionTok"/>
+        </w:rPr>
+        <w:t xml:space="preserve">anova</w:t>
+      </w:r>
+      <w:r>
+        <w:rPr>
+          <w:rStyle w:val="NormalTok"/>
+        </w:rPr>
+        <w:t xml:space="preserve">(m_inv, m_all)</w:t>
+      </w:r>
+      <w:r>
+        <w:br/>
+      </w:r>
+      <w:r>
+        <w:rPr>
+          <w:rStyle w:val="FunctionTok"/>
+        </w:rPr>
+        <w:t xml:space="preserve">anova</w:t>
+      </w:r>
+      <w:r>
+        <w:rPr>
+          <w:rStyle w:val="NormalTok"/>
+        </w:rPr>
+        <w:t xml:space="preserve">(m_par, m_all)</w:t>
+      </w:r>
+    </w:p>
+    <w:p>
+      <w:pPr>
+        <w:pStyle w:val="FirstParagraph"/>
+      </w:pPr>
+      <w:r>
+        <w:t xml:space="preserve">Output:</w:t>
+      </w:r>
     </w:p>
     <w:p>
       <w:pPr>
@@ -4926,15 +5069,90 @@
       </w:pPr>
       <w:r>
         <w:rPr>
-          <w:rStyle w:val="FunctionTok"/>
-        </w:rPr>
-        <w:t xml:space="preserve">anova</w:t>
-      </w:r>
-      <w:r>
-        <w:rPr>
-          <w:rStyle w:val="NormalTok"/>
-        </w:rPr>
-        <w:t xml:space="preserve">(m_base, m_inv)</w:t>
+          <w:rStyle w:val="VerbatimChar"/>
+        </w:rPr>
+        <w:t xml:space="preserve">## Analysis of Variance Table</w:t>
+      </w:r>
+      <w:r>
+        <w:br/>
+      </w:r>
+      <w:r>
+        <w:rPr>
+          <w:rStyle w:val="VerbatimChar"/>
+        </w:rPr>
+        <w:t xml:space="preserve">## </w:t>
+      </w:r>
+      <w:r>
+        <w:br/>
+      </w:r>
+      <w:r>
+        <w:rPr>
+          <w:rStyle w:val="VerbatimChar"/>
+        </w:rPr>
+        <w:t xml:space="preserve">## Model 1: readingz ~ inc10k + racef + pared + married + momwork</w:t>
+      </w:r>
+      <w:r>
+        <w:br/>
+      </w:r>
+      <w:r>
+        <w:rPr>
+          <w:rStyle w:val="VerbatimChar"/>
+        </w:rPr>
+        <w:t xml:space="preserve">## Model 2: readingz ~ inc10k + racef + pared + married + momwork + cogmatz + </w:t>
+      </w:r>
+      <w:r>
+        <w:br/>
+      </w:r>
+      <w:r>
+        <w:rPr>
+          <w:rStyle w:val="VerbatimChar"/>
+        </w:rPr>
+        <w:t xml:space="preserve">##     parinvz</w:t>
+      </w:r>
+      <w:r>
+        <w:br/>
+      </w:r>
+      <w:r>
+        <w:rPr>
+          <w:rStyle w:val="VerbatimChar"/>
+        </w:rPr>
+        <w:t xml:space="preserve">##   Res.Df   RSS Df Sum of Sq     F              Pr(&gt;F)    </w:t>
+      </w:r>
+      <w:r>
+        <w:br/>
+      </w:r>
+      <w:r>
+        <w:rPr>
+          <w:rStyle w:val="VerbatimChar"/>
+        </w:rPr>
+        <w:t xml:space="preserve">## 1  14830 12257                                           </w:t>
+      </w:r>
+      <w:r>
+        <w:br/>
+      </w:r>
+      <w:r>
+        <w:rPr>
+          <w:rStyle w:val="VerbatimChar"/>
+        </w:rPr>
+        <w:t xml:space="preserve">## 2  14828 12044  2     212.7 130.9 &lt;0.0000000000000002 ***</w:t>
+      </w:r>
+      <w:r>
+        <w:br/>
+      </w:r>
+      <w:r>
+        <w:rPr>
+          <w:rStyle w:val="VerbatimChar"/>
+        </w:rPr>
+        <w:t xml:space="preserve">## ---</w:t>
+      </w:r>
+      <w:r>
+        <w:br/>
+      </w:r>
+      <w:r>
+        <w:rPr>
+          <w:rStyle w:val="VerbatimChar"/>
+        </w:rPr>
+        <w:t xml:space="preserve">## Signif. codes:  0 '***' 0.001 '**' 0.01 '*' 0.05 '.' 0.1 ' ' 1</w:t>
       </w:r>
     </w:p>
     <w:p>
@@ -4972,7 +5190,191 @@
         <w:rPr>
           <w:rStyle w:val="VerbatimChar"/>
         </w:rPr>
-        <w:t xml:space="preserve">## Model 2: readingz ~ inc10k + racef + pared + married + momwork + cogmatz + </w:t>
+        <w:t xml:space="preserve">## Model 2: readingz ~ inc10k + racef + pared + married + momwork + warmthz + </w:t>
+      </w:r>
+      <w:r>
+        <w:br/>
+      </w:r>
+      <w:r>
+        <w:rPr>
+          <w:rStyle w:val="VerbatimChar"/>
+        </w:rPr>
+        <w:t xml:space="preserve">##     cogstimz</w:t>
+      </w:r>
+      <w:r>
+        <w:br/>
+      </w:r>
+      <w:r>
+        <w:rPr>
+          <w:rStyle w:val="VerbatimChar"/>
+        </w:rPr>
+        <w:t xml:space="preserve">##   Res.Df   RSS Df Sum of Sq     F  Pr(&gt;F)   </w:t>
+      </w:r>
+      <w:r>
+        <w:br/>
+      </w:r>
+      <w:r>
+        <w:rPr>
+          <w:rStyle w:val="VerbatimChar"/>
+        </w:rPr>
+        <w:t xml:space="preserve">## 1  14830 12257                              </w:t>
+      </w:r>
+      <w:r>
+        <w:br/>
+      </w:r>
+      <w:r>
+        <w:rPr>
+          <w:rStyle w:val="VerbatimChar"/>
+        </w:rPr>
+        <w:t xml:space="preserve">## 2  14828 12247  2     10.22 6.185 0.00207 **</w:t>
+      </w:r>
+      <w:r>
+        <w:br/>
+      </w:r>
+      <w:r>
+        <w:rPr>
+          <w:rStyle w:val="VerbatimChar"/>
+        </w:rPr>
+        <w:t xml:space="preserve">## ---</w:t>
+      </w:r>
+      <w:r>
+        <w:br/>
+      </w:r>
+      <w:r>
+        <w:rPr>
+          <w:rStyle w:val="VerbatimChar"/>
+        </w:rPr>
+        <w:t xml:space="preserve">## Signif. codes:  0 '***' 0.001 '**' 0.01 '*' 0.05 '.' 0.1 ' ' 1</w:t>
+      </w:r>
+    </w:p>
+    <w:p>
+      <w:pPr>
+        <w:pStyle w:val="SourceCode"/>
+      </w:pPr>
+      <w:r>
+        <w:rPr>
+          <w:rStyle w:val="VerbatimChar"/>
+        </w:rPr>
+        <w:t xml:space="preserve">## Analysis of Variance Table</w:t>
+      </w:r>
+      <w:r>
+        <w:br/>
+      </w:r>
+      <w:r>
+        <w:rPr>
+          <w:rStyle w:val="VerbatimChar"/>
+        </w:rPr>
+        <w:t xml:space="preserve">## </w:t>
+      </w:r>
+      <w:r>
+        <w:br/>
+      </w:r>
+      <w:r>
+        <w:rPr>
+          <w:rStyle w:val="VerbatimChar"/>
+        </w:rPr>
+        <w:t xml:space="preserve">## Model 1: readingz ~ inc10k + racef + pared + married + momwork + foodsecz + </w:t>
+      </w:r>
+      <w:r>
+        <w:br/>
+      </w:r>
+      <w:r>
+        <w:rPr>
+          <w:rStyle w:val="VerbatimChar"/>
+        </w:rPr>
+        <w:t xml:space="preserve">##     meddummy</w:t>
+      </w:r>
+      <w:r>
+        <w:br/>
+      </w:r>
+      <w:r>
+        <w:rPr>
+          <w:rStyle w:val="VerbatimChar"/>
+        </w:rPr>
+        <w:t xml:space="preserve">## Model 2: readingz ~ inc10k + racef + pared + married + momwork + foodsecz + </w:t>
+      </w:r>
+      <w:r>
+        <w:br/>
+      </w:r>
+      <w:r>
+        <w:rPr>
+          <w:rStyle w:val="VerbatimChar"/>
+        </w:rPr>
+        <w:t xml:space="preserve">##     meddummy + cogmatz + parinvz + warmthz + cogstimz</w:t>
+      </w:r>
+      <w:r>
+        <w:br/>
+      </w:r>
+      <w:r>
+        <w:rPr>
+          <w:rStyle w:val="VerbatimChar"/>
+        </w:rPr>
+        <w:t xml:space="preserve">##   Res.Df   RSS Df Sum of Sq    F              Pr(&gt;F)    </w:t>
+      </w:r>
+      <w:r>
+        <w:br/>
+      </w:r>
+      <w:r>
+        <w:rPr>
+          <w:rStyle w:val="VerbatimChar"/>
+        </w:rPr>
+        <w:t xml:space="preserve">## 1  14828 12213                                          </w:t>
+      </w:r>
+      <w:r>
+        <w:br/>
+      </w:r>
+      <w:r>
+        <w:rPr>
+          <w:rStyle w:val="VerbatimChar"/>
+        </w:rPr>
+        <w:t xml:space="preserve">## 2  14824 12014  4     198.7 61.3 &lt;0.0000000000000002 ***</w:t>
+      </w:r>
+      <w:r>
+        <w:br/>
+      </w:r>
+      <w:r>
+        <w:rPr>
+          <w:rStyle w:val="VerbatimChar"/>
+        </w:rPr>
+        <w:t xml:space="preserve">## ---</w:t>
+      </w:r>
+      <w:r>
+        <w:br/>
+      </w:r>
+      <w:r>
+        <w:rPr>
+          <w:rStyle w:val="VerbatimChar"/>
+        </w:rPr>
+        <w:t xml:space="preserve">## Signif. codes:  0 '***' 0.001 '**' 0.01 '*' 0.05 '.' 0.1 ' ' 1</w:t>
+      </w:r>
+    </w:p>
+    <w:p>
+      <w:pPr>
+        <w:pStyle w:val="SourceCode"/>
+      </w:pPr>
+      <w:r>
+        <w:rPr>
+          <w:rStyle w:val="VerbatimChar"/>
+        </w:rPr>
+        <w:t xml:space="preserve">## Analysis of Variance Table</w:t>
+      </w:r>
+      <w:r>
+        <w:br/>
+      </w:r>
+      <w:r>
+        <w:rPr>
+          <w:rStyle w:val="VerbatimChar"/>
+        </w:rPr>
+        <w:t xml:space="preserve">## </w:t>
+      </w:r>
+      <w:r>
+        <w:br/>
+      </w:r>
+      <w:r>
+        <w:rPr>
+          <w:rStyle w:val="VerbatimChar"/>
+        </w:rPr>
+        <w:t xml:space="preserve">## Model 1: readingz ~ inc10k + racef + pared + married + momwork + cogmatz + </w:t>
       </w:r>
       <w:r>
         <w:br/>
@@ -4990,25 +5392,43 @@
         <w:rPr>
           <w:rStyle w:val="VerbatimChar"/>
         </w:rPr>
-        <w:t xml:space="preserve">##   Res.Df   RSS Df Sum of Sq     F              Pr(&gt;F)    </w:t>
-      </w:r>
-      <w:r>
-        <w:br/>
-      </w:r>
-      <w:r>
-        <w:rPr>
-          <w:rStyle w:val="VerbatimChar"/>
-        </w:rPr>
-        <w:t xml:space="preserve">## 1  14830 12257                                           </w:t>
-      </w:r>
-      <w:r>
-        <w:br/>
-      </w:r>
-      <w:r>
-        <w:rPr>
-          <w:rStyle w:val="VerbatimChar"/>
-        </w:rPr>
-        <w:t xml:space="preserve">## 2  14828 12044  2     212.7 130.9 &lt;0.0000000000000002 ***</w:t>
+        <w:t xml:space="preserve">## Model 2: readingz ~ inc10k + racef + pared + married + momwork + foodsecz + </w:t>
+      </w:r>
+      <w:r>
+        <w:br/>
+      </w:r>
+      <w:r>
+        <w:rPr>
+          <w:rStyle w:val="VerbatimChar"/>
+        </w:rPr>
+        <w:t xml:space="preserve">##     meddummy + cogmatz + parinvz + warmthz + cogstimz</w:t>
+      </w:r>
+      <w:r>
+        <w:br/>
+      </w:r>
+      <w:r>
+        <w:rPr>
+          <w:rStyle w:val="VerbatimChar"/>
+        </w:rPr>
+        <w:t xml:space="preserve">##   Res.Df   RSS Df Sum of Sq     F      Pr(&gt;F)    </w:t>
+      </w:r>
+      <w:r>
+        <w:br/>
+      </w:r>
+      <w:r>
+        <w:rPr>
+          <w:rStyle w:val="VerbatimChar"/>
+        </w:rPr>
+        <w:t xml:space="preserve">## 1  14828 12044                                   </w:t>
+      </w:r>
+      <w:r>
+        <w:br/>
+      </w:r>
+      <w:r>
+        <w:rPr>
+          <w:rStyle w:val="VerbatimChar"/>
+        </w:rPr>
+        <w:t xml:space="preserve">## 2  14824 12014  4     30.14 9.296 0.000000169 ***</w:t>
       </w:r>
       <w:r>
         <w:br/>
@@ -5027,368 +5447,6 @@
           <w:rStyle w:val="VerbatimChar"/>
         </w:rPr>
         <w:t xml:space="preserve">## Signif. codes:  0 '***' 0.001 '**' 0.01 '*' 0.05 '.' 0.1 ' ' 1</w:t>
-      </w:r>
-    </w:p>
-    <w:p>
-      <w:pPr>
-        <w:pStyle w:val="SourceCode"/>
-      </w:pPr>
-      <w:r>
-        <w:rPr>
-          <w:rStyle w:val="FunctionTok"/>
-        </w:rPr>
-        <w:t xml:space="preserve">anova</w:t>
-      </w:r>
-      <w:r>
-        <w:rPr>
-          <w:rStyle w:val="NormalTok"/>
-        </w:rPr>
-        <w:t xml:space="preserve">(m_base, m_par)</w:t>
-      </w:r>
-    </w:p>
-    <w:p>
-      <w:pPr>
-        <w:pStyle w:val="SourceCode"/>
-      </w:pPr>
-      <w:r>
-        <w:rPr>
-          <w:rStyle w:val="VerbatimChar"/>
-        </w:rPr>
-        <w:t xml:space="preserve">## Analysis of Variance Table</w:t>
-      </w:r>
-      <w:r>
-        <w:br/>
-      </w:r>
-      <w:r>
-        <w:rPr>
-          <w:rStyle w:val="VerbatimChar"/>
-        </w:rPr>
-        <w:t xml:space="preserve">## </w:t>
-      </w:r>
-      <w:r>
-        <w:br/>
-      </w:r>
-      <w:r>
-        <w:rPr>
-          <w:rStyle w:val="VerbatimChar"/>
-        </w:rPr>
-        <w:t xml:space="preserve">## Model 1: readingz ~ inc10k + racef + pared + married + momwork</w:t>
-      </w:r>
-      <w:r>
-        <w:br/>
-      </w:r>
-      <w:r>
-        <w:rPr>
-          <w:rStyle w:val="VerbatimChar"/>
-        </w:rPr>
-        <w:t xml:space="preserve">## Model 2: readingz ~ inc10k + racef + pared + married + momwork + warmthz + </w:t>
-      </w:r>
-      <w:r>
-        <w:br/>
-      </w:r>
-      <w:r>
-        <w:rPr>
-          <w:rStyle w:val="VerbatimChar"/>
-        </w:rPr>
-        <w:t xml:space="preserve">##     cogstimz</w:t>
-      </w:r>
-      <w:r>
-        <w:br/>
-      </w:r>
-      <w:r>
-        <w:rPr>
-          <w:rStyle w:val="VerbatimChar"/>
-        </w:rPr>
-        <w:t xml:space="preserve">##   Res.Df   RSS Df Sum of Sq     F  Pr(&gt;F)   </w:t>
-      </w:r>
-      <w:r>
-        <w:br/>
-      </w:r>
-      <w:r>
-        <w:rPr>
-          <w:rStyle w:val="VerbatimChar"/>
-        </w:rPr>
-        <w:t xml:space="preserve">## 1  14830 12257                              </w:t>
-      </w:r>
-      <w:r>
-        <w:br/>
-      </w:r>
-      <w:r>
-        <w:rPr>
-          <w:rStyle w:val="VerbatimChar"/>
-        </w:rPr>
-        <w:t xml:space="preserve">## 2  14828 12247  2     10.22 6.185 0.00207 **</w:t>
-      </w:r>
-      <w:r>
-        <w:br/>
-      </w:r>
-      <w:r>
-        <w:rPr>
-          <w:rStyle w:val="VerbatimChar"/>
-        </w:rPr>
-        <w:t xml:space="preserve">## ---</w:t>
-      </w:r>
-      <w:r>
-        <w:br/>
-      </w:r>
-      <w:r>
-        <w:rPr>
-          <w:rStyle w:val="VerbatimChar"/>
-        </w:rPr>
-        <w:t xml:space="preserve">## Signif. codes:  0 '***' 0.001 '**' 0.01 '*' 0.05 '.' 0.1 ' ' 1</w:t>
-      </w:r>
-    </w:p>
-    <w:p>
-      <w:pPr>
-        <w:pStyle w:val="SourceCode"/>
-      </w:pPr>
-      <w:r>
-        <w:rPr>
-          <w:rStyle w:val="FunctionTok"/>
-        </w:rPr>
-        <w:t xml:space="preserve">anova</w:t>
-      </w:r>
-      <w:r>
-        <w:rPr>
-          <w:rStyle w:val="NormalTok"/>
-        </w:rPr>
-        <w:t xml:space="preserve">(m_mat, m_all)</w:t>
-      </w:r>
-    </w:p>
-    <w:p>
-      <w:pPr>
-        <w:pStyle w:val="SourceCode"/>
-      </w:pPr>
-      <w:r>
-        <w:rPr>
-          <w:rStyle w:val="VerbatimChar"/>
-        </w:rPr>
-        <w:t xml:space="preserve">## Analysis of Variance Table</w:t>
-      </w:r>
-      <w:r>
-        <w:br/>
-      </w:r>
-      <w:r>
-        <w:rPr>
-          <w:rStyle w:val="VerbatimChar"/>
-        </w:rPr>
-        <w:t xml:space="preserve">## </w:t>
-      </w:r>
-      <w:r>
-        <w:br/>
-      </w:r>
-      <w:r>
-        <w:rPr>
-          <w:rStyle w:val="VerbatimChar"/>
-        </w:rPr>
-        <w:t xml:space="preserve">## Model 1: readingz ~ inc10k + racef + pared + married + momwork + foodsecz + </w:t>
-      </w:r>
-      <w:r>
-        <w:br/>
-      </w:r>
-      <w:r>
-        <w:rPr>
-          <w:rStyle w:val="VerbatimChar"/>
-        </w:rPr>
-        <w:t xml:space="preserve">##     meddummy</w:t>
-      </w:r>
-      <w:r>
-        <w:br/>
-      </w:r>
-      <w:r>
-        <w:rPr>
-          <w:rStyle w:val="VerbatimChar"/>
-        </w:rPr>
-        <w:t xml:space="preserve">## Model 2: readingz ~ inc10k + racef + pared + married + momwork + foodsecz + </w:t>
-      </w:r>
-      <w:r>
-        <w:br/>
-      </w:r>
-      <w:r>
-        <w:rPr>
-          <w:rStyle w:val="VerbatimChar"/>
-        </w:rPr>
-        <w:t xml:space="preserve">##     meddummy + cogmatz + parinvz + warmthz + cogstimz</w:t>
-      </w:r>
-      <w:r>
-        <w:br/>
-      </w:r>
-      <w:r>
-        <w:rPr>
-          <w:rStyle w:val="VerbatimChar"/>
-        </w:rPr>
-        <w:t xml:space="preserve">##   Res.Df   RSS Df Sum of Sq    F              Pr(&gt;F)    </w:t>
-      </w:r>
-      <w:r>
-        <w:br/>
-      </w:r>
-      <w:r>
-        <w:rPr>
-          <w:rStyle w:val="VerbatimChar"/>
-        </w:rPr>
-        <w:t xml:space="preserve">## 1  14828 12213                                          </w:t>
-      </w:r>
-      <w:r>
-        <w:br/>
-      </w:r>
-      <w:r>
-        <w:rPr>
-          <w:rStyle w:val="VerbatimChar"/>
-        </w:rPr>
-        <w:t xml:space="preserve">## 2  14824 12014  4     198.7 61.3 &lt;0.0000000000000002 ***</w:t>
-      </w:r>
-      <w:r>
-        <w:br/>
-      </w:r>
-      <w:r>
-        <w:rPr>
-          <w:rStyle w:val="VerbatimChar"/>
-        </w:rPr>
-        <w:t xml:space="preserve">## ---</w:t>
-      </w:r>
-      <w:r>
-        <w:br/>
-      </w:r>
-      <w:r>
-        <w:rPr>
-          <w:rStyle w:val="VerbatimChar"/>
-        </w:rPr>
-        <w:t xml:space="preserve">## Signif. codes:  0 '***' 0.001 '**' 0.01 '*' 0.05 '.' 0.1 ' ' 1</w:t>
-      </w:r>
-    </w:p>
-    <w:p>
-      <w:pPr>
-        <w:pStyle w:val="SourceCode"/>
-      </w:pPr>
-      <w:r>
-        <w:rPr>
-          <w:rStyle w:val="FunctionTok"/>
-        </w:rPr>
-        <w:t xml:space="preserve">anova</w:t>
-      </w:r>
-      <w:r>
-        <w:rPr>
-          <w:rStyle w:val="NormalTok"/>
-        </w:rPr>
-        <w:t xml:space="preserve">(m_inv, m_all)</w:t>
-      </w:r>
-    </w:p>
-    <w:p>
-      <w:pPr>
-        <w:pStyle w:val="SourceCode"/>
-      </w:pPr>
-      <w:r>
-        <w:rPr>
-          <w:rStyle w:val="VerbatimChar"/>
-        </w:rPr>
-        <w:t xml:space="preserve">## Analysis of Variance Table</w:t>
-      </w:r>
-      <w:r>
-        <w:br/>
-      </w:r>
-      <w:r>
-        <w:rPr>
-          <w:rStyle w:val="VerbatimChar"/>
-        </w:rPr>
-        <w:t xml:space="preserve">## </w:t>
-      </w:r>
-      <w:r>
-        <w:br/>
-      </w:r>
-      <w:r>
-        <w:rPr>
-          <w:rStyle w:val="VerbatimChar"/>
-        </w:rPr>
-        <w:t xml:space="preserve">## Model 1: readingz ~ inc10k + racef + pared + married + momwork + cogmatz + </w:t>
-      </w:r>
-      <w:r>
-        <w:br/>
-      </w:r>
-      <w:r>
-        <w:rPr>
-          <w:rStyle w:val="VerbatimChar"/>
-        </w:rPr>
-        <w:t xml:space="preserve">##     parinvz</w:t>
-      </w:r>
-      <w:r>
-        <w:br/>
-      </w:r>
-      <w:r>
-        <w:rPr>
-          <w:rStyle w:val="VerbatimChar"/>
-        </w:rPr>
-        <w:t xml:space="preserve">## Model 2: readingz ~ inc10k + racef + pared + married + momwork + foodsecz + </w:t>
-      </w:r>
-      <w:r>
-        <w:br/>
-      </w:r>
-      <w:r>
-        <w:rPr>
-          <w:rStyle w:val="VerbatimChar"/>
-        </w:rPr>
-        <w:t xml:space="preserve">##     meddummy + cogmatz + parinvz + warmthz + cogstimz</w:t>
-      </w:r>
-      <w:r>
-        <w:br/>
-      </w:r>
-      <w:r>
-        <w:rPr>
-          <w:rStyle w:val="VerbatimChar"/>
-        </w:rPr>
-        <w:t xml:space="preserve">##   Res.Df   RSS Df Sum of Sq     F      Pr(&gt;F)    </w:t>
-      </w:r>
-      <w:r>
-        <w:br/>
-      </w:r>
-      <w:r>
-        <w:rPr>
-          <w:rStyle w:val="VerbatimChar"/>
-        </w:rPr>
-        <w:t xml:space="preserve">## 1  14828 12044                                   </w:t>
-      </w:r>
-      <w:r>
-        <w:br/>
-      </w:r>
-      <w:r>
-        <w:rPr>
-          <w:rStyle w:val="VerbatimChar"/>
-        </w:rPr>
-        <w:t xml:space="preserve">## 2  14824 12014  4     30.14 9.296 0.000000169 ***</w:t>
-      </w:r>
-      <w:r>
-        <w:br/>
-      </w:r>
-      <w:r>
-        <w:rPr>
-          <w:rStyle w:val="VerbatimChar"/>
-        </w:rPr>
-        <w:t xml:space="preserve">## ---</w:t>
-      </w:r>
-      <w:r>
-        <w:br/>
-      </w:r>
-      <w:r>
-        <w:rPr>
-          <w:rStyle w:val="VerbatimChar"/>
-        </w:rPr>
-        <w:t xml:space="preserve">## Signif. codes:  0 '***' 0.001 '**' 0.01 '*' 0.05 '.' 0.1 ' ' 1</w:t>
-      </w:r>
-    </w:p>
-    <w:p>
-      <w:pPr>
-        <w:pStyle w:val="SourceCode"/>
-      </w:pPr>
-      <w:r>
-        <w:rPr>
-          <w:rStyle w:val="FunctionTok"/>
-        </w:rPr>
-        <w:t xml:space="preserve">anova</w:t>
-      </w:r>
-      <w:r>
-        <w:rPr>
-          <w:rStyle w:val="NormalTok"/>
-        </w:rPr>
-        <w:t xml:space="preserve">(m_par, m_all)</w:t>
       </w:r>
     </w:p>
     <w:p>
@@ -5512,6 +5570,14 @@
     </w:p>
     <w:p>
       <w:pPr>
+        <w:pStyle w:val="BodyText"/>
+      </w:pPr>
+      <w:r>
+        <w:t xml:space="preserve">Syntax:</w:t>
+      </w:r>
+    </w:p>
+    <w:p>
+      <w:pPr>
         <w:pStyle w:val="SourceCode"/>
       </w:pPr>
       <w:r>
@@ -6041,6 +6107,14 @@
           <w:rStyle w:val="NormalTok"/>
         </w:rPr>
         <w:t xml:space="preserve">)</w:t>
+      </w:r>
+    </w:p>
+    <w:p>
+      <w:pPr>
+        <w:pStyle w:val="FirstParagraph"/>
+      </w:pPr>
+      <w:r>
+        <w:t xml:space="preserve">Output:</w:t>
       </w:r>
     </w:p>
     <w:p>
@@ -6104,6 +6178,14 @@
         <w:pStyle w:val="BodyText"/>
       </w:pPr>
       <w:r>
+        <w:t xml:space="preserve">Output:</w:t>
+      </w:r>
+    </w:p>
+    <w:p>
+      <w:pPr>
+        <w:pStyle w:val="BodyText"/>
+      </w:pPr>
+      <w:r>
         <w:t xml:space="preserve">Adding all mediator blocks reduced the income slope by 26.64%, indicating that the income-reading association is partially explained by these mediators but not eliminated.</w:t>
       </w:r>
     </w:p>
@@ -6174,6 +6256,14 @@
       </w:r>
       <w:r>
         <w:t xml:space="preserve">address them in a bulletpoint fashion.</w:t>
+      </w:r>
+    </w:p>
+    <w:p>
+      <w:pPr>
+        <w:pStyle w:val="BodyText"/>
+      </w:pPr>
+      <w:r>
+        <w:t xml:space="preserve">Output:</w:t>
       </w:r>
     </w:p>
     <w:p>

</xml_diff>